<commit_message>
Create phase folders in documentation
</commit_message>
<xml_diff>
--- a/Documentation/MeetingMinutes.docx
+++ b/Documentation/MeetingMinutes.docx
@@ -92,7 +92,15 @@
         </w:numPr>
       </w:pPr>
       <w:r>
-        <w:t>2. Confirmed everyone had access to git repo.</w:t>
+        <w:t xml:space="preserve">2. Confirmed everyone had access to </w:t>
+      </w:r>
+      <w:proofErr w:type="spellStart"/>
+      <w:r>
+        <w:t>git</w:t>
+      </w:r>
+      <w:proofErr w:type="spellEnd"/>
+      <w:r>
+        <w:t xml:space="preserve"> repo.</w:t>
       </w:r>
       <w:r>
         <w:br w:type="page"/>
@@ -318,8 +326,16 @@
         <w:rPr>
           <w:color w:val="000000"/>
         </w:rPr>
-        <w:t>Creating different branches in order to being able to work on separate tasks in the Github</w:t>
-      </w:r>
+        <w:t xml:space="preserve">Creating different branches in order to being able to work on separate tasks in the </w:t>
+      </w:r>
+      <w:proofErr w:type="spellStart"/>
+      <w:r>
+        <w:rPr>
+          <w:color w:val="000000"/>
+        </w:rPr>
+        <w:t>Github</w:t>
+      </w:r>
+      <w:proofErr w:type="spellEnd"/>
     </w:p>
     <w:p>
       <w:pPr>
@@ -332,11 +348,19 @@
           <w:color w:val="000000"/>
         </w:rPr>
       </w:pPr>
-      <w:r>
-        <w:rPr>
-          <w:color w:val="000000"/>
-        </w:rPr>
-        <w:t xml:space="preserve">Github rules: 1. Pull from main branch 2. Create/Enter own branch 3. Work on own Branch 4. Merge into main.  </w:t>
+      <w:proofErr w:type="spellStart"/>
+      <w:r>
+        <w:rPr>
+          <w:color w:val="000000"/>
+        </w:rPr>
+        <w:t>Github</w:t>
+      </w:r>
+      <w:proofErr w:type="spellEnd"/>
+      <w:r>
+        <w:rPr>
+          <w:color w:val="000000"/>
+        </w:rPr>
+        <w:t xml:space="preserve"> rules: 1. Pull from main branch 2. Create/Enter own branch 3. Work on own Branch 4. Merge into main.  </w:t>
       </w:r>
     </w:p>
     <w:p>
@@ -1170,37 +1194,16 @@
         <w:jc w:val="center"/>
       </w:pPr>
       <w:r>
-        <w:t xml:space="preserve">Date/Time: </w:t>
-      </w:r>
-      <w:r>
-        <w:t>3/12</w:t>
-      </w:r>
-      <w:r>
-        <w:t xml:space="preserve">/2026, </w:t>
-      </w:r>
-      <w:r>
-        <w:t>6:45P</w:t>
-      </w:r>
-      <w:r>
-        <w:t xml:space="preserve">M – </w:t>
-      </w:r>
-      <w:r>
-        <w:t>7:30P</w:t>
-      </w:r>
-      <w:r>
-        <w:t>M</w:t>
-      </w:r>
-    </w:p>
-    <w:p>
-      <w:pPr>
-        <w:spacing w:after="140" w:line="276" w:lineRule="auto"/>
-        <w:jc w:val="center"/>
-      </w:pPr>
-      <w:r>
-        <w:t xml:space="preserve">Topic: </w:t>
-      </w:r>
-      <w:r>
-        <w:t>Moving to design phase, where to start?</w:t>
+        <w:t>Date/Time: 3/12/2026, 6:45PM – 7:30PM</w:t>
+      </w:r>
+    </w:p>
+    <w:p>
+      <w:pPr>
+        <w:spacing w:after="140" w:line="276" w:lineRule="auto"/>
+        <w:jc w:val="center"/>
+      </w:pPr>
+      <w:r>
+        <w:t>Topic: Moving to design phase, where to start?</w:t>
       </w:r>
     </w:p>
     <w:p>
@@ -1254,13 +1257,7 @@
         <w:ind w:left="720"/>
       </w:pPr>
       <w:r>
-        <w:t xml:space="preserve">4. </w:t>
-      </w:r>
-      <w:r>
-        <w:t>Take some of the more important classes we have identified</w:t>
-      </w:r>
-      <w:r>
-        <w:t>, and treat them like modules</w:t>
+        <w:t>4. Take some of the more important classes we have identified, and treat them like modules</w:t>
       </w:r>
     </w:p>
     <w:p>
@@ -1346,16 +1343,7 @@
         <w:ind w:left="1080"/>
       </w:pPr>
       <w:r>
-        <w:t xml:space="preserve">Assigned rough draft for class diagram of the </w:t>
-      </w:r>
-      <w:r>
-        <w:t>user</w:t>
-      </w:r>
-      <w:r>
-        <w:t xml:space="preserve"> module:  </w:t>
-      </w:r>
-      <w:r>
-        <w:t>Manny</w:t>
+        <w:t>Assigned rough draft for class diagram of the user module:  Manny</w:t>
       </w:r>
     </w:p>
     <w:p>
@@ -1369,21 +1357,228 @@
         <w:ind w:left="1080"/>
       </w:pPr>
       <w:r>
-        <w:t xml:space="preserve">Assigned rough draft for class diagram of the </w:t>
-      </w:r>
-      <w:r>
-        <w:t>GUI</w:t>
-      </w:r>
-      <w:r>
-        <w:t xml:space="preserve"> module:  </w:t>
-      </w:r>
-      <w:r>
-        <w:t>Paul</w:t>
-      </w:r>
-    </w:p>
-    <w:p>
-      <w:pPr>
-        <w:spacing w:after="140" w:line="276" w:lineRule="auto"/>
+        <w:t>Assigned rough draft for class diagram of the GUI module:  Paul</w:t>
+      </w:r>
+    </w:p>
+    <w:p>
+      <w:r>
+        <w:br w:type="page"/>
+      </w:r>
+    </w:p>
+    <w:p>
+      <w:pPr>
+        <w:pStyle w:val="ListParagraph"/>
+        <w:spacing w:after="140" w:line="276" w:lineRule="auto"/>
+        <w:ind w:left="1080"/>
+      </w:pPr>
+    </w:p>
+    <w:p>
+      <w:pPr>
+        <w:numPr>
+          <w:ilvl w:val="0"/>
+          <w:numId w:val="4"/>
+        </w:numPr>
+        <w:spacing w:after="140" w:line="276" w:lineRule="auto"/>
+        <w:jc w:val="center"/>
+        <w:rPr>
+          <w:b/>
+          <w:bCs/>
+          <w:sz w:val="36"/>
+          <w:szCs w:val="36"/>
+        </w:rPr>
+      </w:pPr>
+      <w:r>
+        <w:rPr>
+          <w:b/>
+          <w:bCs/>
+          <w:sz w:val="36"/>
+          <w:szCs w:val="36"/>
+        </w:rPr>
+        <w:t>Meeting Minutes</w:t>
+      </w:r>
+    </w:p>
+    <w:p>
+      <w:pPr>
+        <w:spacing w:after="140" w:line="276" w:lineRule="auto"/>
+        <w:jc w:val="center"/>
+      </w:pPr>
+      <w:r>
+        <w:t>Group: Manuel G, Paul C, Nick V</w:t>
+      </w:r>
+    </w:p>
+    <w:p>
+      <w:pPr>
+        <w:spacing w:after="140" w:line="276" w:lineRule="auto"/>
+        <w:jc w:val="center"/>
+      </w:pPr>
+      <w:r>
+        <w:t>Date/Time: 3/19/2026, 6:15 PM – 8:20 PM</w:t>
+      </w:r>
+    </w:p>
+    <w:p>
+      <w:pPr>
+        <w:spacing w:after="140" w:line="276" w:lineRule="auto"/>
+        <w:jc w:val="center"/>
+      </w:pPr>
+      <w:r>
+        <w:t>Topic: Design Phase (UML Class Diagram Expansion)</w:t>
+      </w:r>
+    </w:p>
+    <w:p>
+      <w:pPr>
+        <w:numPr>
+          <w:ilvl w:val="1"/>
+          <w:numId w:val="4"/>
+        </w:numPr>
+        <w:spacing w:after="140" w:line="276" w:lineRule="auto"/>
+        <w:jc w:val="center"/>
+        <w:rPr>
+          <w:b/>
+          <w:bCs/>
+          <w:u w:val="single"/>
+        </w:rPr>
+      </w:pPr>
+    </w:p>
+    <w:p>
+      <w:pPr>
+        <w:numPr>
+          <w:ilvl w:val="1"/>
+          <w:numId w:val="4"/>
+        </w:numPr>
+        <w:spacing w:after="140" w:line="276" w:lineRule="auto"/>
+        <w:rPr>
+          <w:b/>
+          <w:bCs/>
+          <w:u w:val="single"/>
+        </w:rPr>
+      </w:pPr>
+      <w:r>
+        <w:rPr>
+          <w:b/>
+          <w:bCs/>
+          <w:u w:val="single"/>
+        </w:rPr>
+        <w:t>Discussion</w:t>
+      </w:r>
+    </w:p>
+    <w:p>
+      <w:pPr>
+        <w:spacing w:after="140" w:line="276" w:lineRule="auto"/>
+        <w:ind w:left="720"/>
+      </w:pPr>
+      <w:r>
+        <w:t>Touched base on outlines for classes we were each assigned, discussed improvements and goals</w:t>
+      </w:r>
+      <w:r>
+        <w:t xml:space="preserve"> </w:t>
+      </w:r>
+      <w:r>
+        <w:t>for bringing them into the design document. Discussion about approach to design, informing design from loose coding structure, and clarification on dynamics for the game play (real casino rules/simulated blackjack) as well as user credentials and storage.</w:t>
+      </w:r>
+    </w:p>
+    <w:p>
+      <w:pPr>
+        <w:spacing w:after="140" w:line="276" w:lineRule="auto"/>
+        <w:jc w:val="center"/>
+      </w:pPr>
+    </w:p>
+    <w:p>
+      <w:pPr>
+        <w:spacing w:after="140" w:line="276" w:lineRule="auto"/>
+      </w:pPr>
+      <w:r>
+        <w:t>Action Items:</w:t>
+      </w:r>
+    </w:p>
+    <w:p>
+      <w:pPr>
+        <w:spacing w:after="140" w:line="276" w:lineRule="auto"/>
+        <w:ind w:firstLine="720"/>
+      </w:pPr>
+      <w:r>
+        <w:t>Continue working on UML class diagrams – all</w:t>
+      </w:r>
+    </w:p>
+    <w:p>
+      <w:pPr>
+        <w:spacing w:after="140" w:line="276" w:lineRule="auto"/>
+        <w:ind w:firstLine="720"/>
+      </w:pPr>
+      <w:r>
+        <w:t>Consider plans for translating diagrams and insights to Design Document – all</w:t>
+      </w:r>
+    </w:p>
+    <w:p>
+      <w:pPr>
+        <w:spacing w:after="140" w:line="276" w:lineRule="auto"/>
+        <w:ind w:firstLine="720"/>
+      </w:pPr>
+      <w:r>
+        <w:t>Reconvene next week/after midterm to discuss approach for design phase workload</w:t>
+      </w:r>
+    </w:p>
+    <w:p>
+      <w:r>
+        <w:br w:type="page"/>
+      </w:r>
+    </w:p>
+    <w:p>
+      <w:pPr>
+        <w:numPr>
+          <w:ilvl w:val="0"/>
+          <w:numId w:val="4"/>
+        </w:numPr>
+        <w:spacing w:after="140" w:line="276" w:lineRule="auto"/>
+        <w:jc w:val="center"/>
+        <w:rPr>
+          <w:b/>
+          <w:bCs/>
+          <w:sz w:val="36"/>
+          <w:szCs w:val="36"/>
+        </w:rPr>
+      </w:pPr>
+      <w:r>
+        <w:rPr>
+          <w:b/>
+          <w:bCs/>
+          <w:sz w:val="36"/>
+          <w:szCs w:val="36"/>
+        </w:rPr>
+        <w:lastRenderedPageBreak/>
+        <w:t>Meeting Minutes</w:t>
+      </w:r>
+    </w:p>
+    <w:p>
+      <w:pPr>
+        <w:spacing w:after="140" w:line="276" w:lineRule="auto"/>
+        <w:jc w:val="center"/>
+      </w:pPr>
+      <w:r>
+        <w:t>Group: Manuel G, Paul C, Nick V</w:t>
+      </w:r>
+    </w:p>
+    <w:p>
+      <w:pPr>
+        <w:spacing w:after="140" w:line="276" w:lineRule="auto"/>
+        <w:jc w:val="center"/>
+      </w:pPr>
+      <w:r>
+        <w:t>Date/Time: /2026, 6:15 PM – 8:20 PM</w:t>
+      </w:r>
+    </w:p>
+    <w:p>
+      <w:pPr>
+        <w:spacing w:after="140" w:line="276" w:lineRule="auto"/>
+        <w:jc w:val="center"/>
+      </w:pPr>
+      <w:r>
+        <w:t xml:space="preserve">Topic: </w:t>
+      </w:r>
+    </w:p>
+    <w:p>
+      <w:pPr>
+        <w:spacing w:after="140" w:line="276" w:lineRule="auto"/>
+        <w:jc w:val="center"/>
       </w:pPr>
     </w:p>
     <w:sectPr>
@@ -1748,6 +1943,119 @@
       </w:pPr>
     </w:lvl>
   </w:abstractNum>
+  <w:abstractNum w:abstractNumId="3" w15:restartNumberingAfterBreak="0">
+    <w:nsid w:val="5A79195C"/>
+    <w:multiLevelType w:val="multilevel"/>
+    <w:tmpl w:val="58AA0E0E"/>
+    <w:lvl w:ilvl="0">
+      <w:start w:val="1"/>
+      <w:numFmt w:val="decimal"/>
+      <w:lvlText w:val=""/>
+      <w:lvlJc w:val="left"/>
+      <w:pPr>
+        <w:tabs>
+          <w:tab w:val="num" w:pos="0"/>
+        </w:tabs>
+        <w:ind w:left="0" w:firstLine="0"/>
+      </w:pPr>
+    </w:lvl>
+    <w:lvl w:ilvl="1">
+      <w:start w:val="1"/>
+      <w:numFmt w:val="decimal"/>
+      <w:lvlText w:val=""/>
+      <w:lvlJc w:val="left"/>
+      <w:pPr>
+        <w:tabs>
+          <w:tab w:val="num" w:pos="0"/>
+        </w:tabs>
+        <w:ind w:left="0" w:firstLine="0"/>
+      </w:pPr>
+    </w:lvl>
+    <w:lvl w:ilvl="2">
+      <w:start w:val="1"/>
+      <w:numFmt w:val="decimal"/>
+      <w:lvlText w:val=""/>
+      <w:lvlJc w:val="left"/>
+      <w:pPr>
+        <w:tabs>
+          <w:tab w:val="num" w:pos="0"/>
+        </w:tabs>
+        <w:ind w:left="0" w:firstLine="0"/>
+      </w:pPr>
+    </w:lvl>
+    <w:lvl w:ilvl="3">
+      <w:start w:val="1"/>
+      <w:numFmt w:val="decimal"/>
+      <w:lvlText w:val=""/>
+      <w:lvlJc w:val="left"/>
+      <w:pPr>
+        <w:tabs>
+          <w:tab w:val="num" w:pos="0"/>
+        </w:tabs>
+        <w:ind w:left="0" w:firstLine="0"/>
+      </w:pPr>
+    </w:lvl>
+    <w:lvl w:ilvl="4">
+      <w:start w:val="1"/>
+      <w:numFmt w:val="decimal"/>
+      <w:lvlText w:val=""/>
+      <w:lvlJc w:val="left"/>
+      <w:pPr>
+        <w:tabs>
+          <w:tab w:val="num" w:pos="0"/>
+        </w:tabs>
+        <w:ind w:left="0" w:firstLine="0"/>
+      </w:pPr>
+    </w:lvl>
+    <w:lvl w:ilvl="5">
+      <w:start w:val="1"/>
+      <w:numFmt w:val="decimal"/>
+      <w:lvlText w:val=""/>
+      <w:lvlJc w:val="left"/>
+      <w:pPr>
+        <w:tabs>
+          <w:tab w:val="num" w:pos="0"/>
+        </w:tabs>
+        <w:ind w:left="0" w:firstLine="0"/>
+      </w:pPr>
+    </w:lvl>
+    <w:lvl w:ilvl="6">
+      <w:start w:val="1"/>
+      <w:numFmt w:val="decimal"/>
+      <w:lvlText w:val=""/>
+      <w:lvlJc w:val="left"/>
+      <w:pPr>
+        <w:tabs>
+          <w:tab w:val="num" w:pos="0"/>
+        </w:tabs>
+        <w:ind w:left="0" w:firstLine="0"/>
+      </w:pPr>
+    </w:lvl>
+    <w:lvl w:ilvl="7">
+      <w:start w:val="1"/>
+      <w:numFmt w:val="decimal"/>
+      <w:lvlText w:val=""/>
+      <w:lvlJc w:val="left"/>
+      <w:pPr>
+        <w:tabs>
+          <w:tab w:val="num" w:pos="0"/>
+        </w:tabs>
+        <w:ind w:left="0" w:firstLine="0"/>
+      </w:pPr>
+    </w:lvl>
+    <w:lvl w:ilvl="8">
+      <w:start w:val="1"/>
+      <w:numFmt w:val="decimal"/>
+      <w:lvlText w:val=""/>
+      <w:lvlJc w:val="left"/>
+      <w:pPr>
+        <w:tabs>
+          <w:tab w:val="num" w:pos="0"/>
+        </w:tabs>
+        <w:ind w:left="0" w:firstLine="0"/>
+      </w:pPr>
+    </w:lvl>
+  </w:abstractNum>
   <w:num w:numId="1" w16cid:durableId="1408773028">
     <w:abstractNumId w:val="2"/>
   </w:num>
@@ -1756,6 +2064,36 @@
   </w:num>
   <w:num w:numId="3" w16cid:durableId="1258367406">
     <w:abstractNumId w:val="1"/>
+  </w:num>
+  <w:num w:numId="4" w16cid:durableId="290789208">
+    <w:abstractNumId w:val="3"/>
+    <w:lvlOverride w:ilvl="0">
+      <w:startOverride w:val="1"/>
+    </w:lvlOverride>
+    <w:lvlOverride w:ilvl="1">
+      <w:startOverride w:val="1"/>
+    </w:lvlOverride>
+    <w:lvlOverride w:ilvl="2">
+      <w:startOverride w:val="1"/>
+    </w:lvlOverride>
+    <w:lvlOverride w:ilvl="3">
+      <w:startOverride w:val="1"/>
+    </w:lvlOverride>
+    <w:lvlOverride w:ilvl="4">
+      <w:startOverride w:val="1"/>
+    </w:lvlOverride>
+    <w:lvlOverride w:ilvl="5">
+      <w:startOverride w:val="1"/>
+    </w:lvlOverride>
+    <w:lvlOverride w:ilvl="6">
+      <w:startOverride w:val="1"/>
+    </w:lvlOverride>
+    <w:lvlOverride w:ilvl="7">
+      <w:startOverride w:val="1"/>
+    </w:lvlOverride>
+    <w:lvlOverride w:ilvl="8">
+      <w:startOverride w:val="1"/>
+    </w:lvlOverride>
   </w:num>
 </w:numbering>
 </file>
@@ -2283,7 +2621,6 @@
   <w:style w:type="character" w:default="1" w:styleId="DefaultParagraphFont">
     <w:name w:val="Default Paragraph Font"/>
     <w:uiPriority w:val="1"/>
-    <w:semiHidden/>
     <w:unhideWhenUsed/>
   </w:style>
   <w:style w:type="table" w:default="1" w:styleId="TableNormal">

</xml_diff>

<commit_message>
adding user and userRole classes, fix minutes
</commit_message>
<xml_diff>
--- a/Documentation/MeetingMinutes.docx
+++ b/Documentation/MeetingMinutes.docx
@@ -2314,11 +2314,9 @@
       <w:r>
         <w:t xml:space="preserve">One giant list of </w:t>
       </w:r>
-      <w:proofErr w:type="spellStart"/>
-      <w:r>
-        <w:t>enums</w:t>
-      </w:r>
-      <w:proofErr w:type="spellEnd"/>
+      <w:r>
+        <w:t>Enums</w:t>
+      </w:r>
       <w:r>
         <w:t xml:space="preserve"> for type</w:t>
       </w:r>
@@ -2333,11 +2331,9 @@
       <w:r>
         <w:t xml:space="preserve">Or small type, and multiple subtype </w:t>
       </w:r>
-      <w:proofErr w:type="spellStart"/>
-      <w:r>
-        <w:t>enums</w:t>
-      </w:r>
-      <w:proofErr w:type="spellEnd"/>
+      <w:r>
+        <w:t>Enums</w:t>
+      </w:r>
     </w:p>
     <w:p>
       <w:pPr>
@@ -2376,13 +2372,9 @@
       <w:r>
         <w:t xml:space="preserve">match definitions to SDD (remove </w:t>
       </w:r>
-      <w:proofErr w:type="spellStart"/>
-      <w:proofErr w:type="gramStart"/>
-      <w:r>
-        <w:t>creditcard</w:t>
-      </w:r>
-      <w:proofErr w:type="spellEnd"/>
-      <w:proofErr w:type="gramEnd"/>
+      <w:r>
+        <w:t>credit card</w:t>
+      </w:r>
       <w:r>
         <w:t>)</w:t>
       </w:r>
@@ -2427,11 +2419,9 @@
       <w:r>
         <w:t xml:space="preserve"> multithreading within each client thread to handle multiple inbound outbound messages </w:t>
       </w:r>
-      <w:proofErr w:type="spellStart"/>
-      <w:r>
-        <w:t>simutatneously</w:t>
-      </w:r>
-      <w:proofErr w:type="spellEnd"/>
+      <w:r>
+        <w:t>simultaneously</w:t>
+      </w:r>
     </w:p>
     <w:p>
       <w:pPr>

</xml_diff>